<commit_message>
fix(exports): render saved royalty amounts in docx
Background renderer now fills {{bang_tinh_tien_ban_quyen}} and legacy
{{tien_ban_quyen}} from DB money columns instead of leaving raw placeholders.
Source: royalty_amount_before_vat/vat_amount/royalty_amount_after_vat,
fallback to amount_before_vat/amount_after_vat (vat = after - before).
No royalty formula recomputed in renderer; only formatted output.

Co-Authored-By: Claude <noreply@anthropic.com>
Co-authored-by: Cursor <cursoragent@cursor.com>
</commit_message>
<xml_diff>
--- a/templates/Background/export_template_contract_1.docx
+++ b/templates/Background/export_template_contract_1.docx
@@ -1,6 +1,6 @@
 
 <file path=word/document.xml><?xml version="1.0" encoding="utf-8"?>
-<w:document xmlns:wpc="http://schemas.microsoft.com/office/word/2010/wordprocessingCanvas" xmlns:cx="http://schemas.microsoft.com/office/drawing/2014/chartex" xmlns:cx1="http://schemas.microsoft.com/office/drawing/2015/9/8/chartex" xmlns:cx2="http://schemas.microsoft.com/office/drawing/2015/10/21/chartex" xmlns:cx3="http://schemas.microsoft.com/office/drawing/2016/5/9/chartex" xmlns:cx4="http://schemas.microsoft.com/office/drawing/2016/5/10/chartex" xmlns:cx5="http://schemas.microsoft.com/office/drawing/2016/5/11/chartex" xmlns:cx6="http://schemas.microsoft.com/office/drawing/2016/5/12/chartex" xmlns:cx7="http://schemas.microsoft.com/office/drawing/2016/5/13/chartex" xmlns:cx8="http://schemas.microsoft.com/office/drawing/2016/5/14/chartex" xmlns:mc="http://schemas.openxmlformats.org/markup-compatibility/2006" xmlns:aink="http://schemas.microsoft.com/office/drawing/2016/ink" xmlns:am3d="http://schemas.microsoft.com/office/drawing/2017/model3d" xmlns:o="urn:schemas-microsoft-com:office:office" xmlns:oel="http://schemas.microsoft.com/office/2019/extlst" xmlns:r="http://schemas.openxmlformats.org/officeDocument/2006/relationships" xmlns:m="http://schemas.openxmlformats.org/officeDocument/2006/math" xmlns:v="urn:schemas-microsoft-com:vml" xmlns:wp14="http://schemas.microsoft.com/office/word/2010/wordprocessingDrawing" xmlns:wp="http://schemas.openxmlformats.org/drawingml/2006/wordprocessingDrawing" xmlns:w10="urn:schemas-microsoft-com:office:word" xmlns:w="http://schemas.openxmlformats.org/wordprocessingml/2006/main" xmlns:w14="http://schemas.microsoft.com/office/word/2010/wordml" xmlns:w15="http://schemas.microsoft.com/office/word/2012/wordml" xmlns:w16cex="http://schemas.microsoft.com/office/word/2018/wordml/cex" xmlns:w16cid="http://schemas.microsoft.com/office/word/2016/wordml/cid" xmlns:w16="http://schemas.microsoft.com/office/word/2018/wordml" xmlns:w16du="http://schemas.microsoft.com/office/word/2023/wordml/word16du" xmlns:w16sdtdh="http://schemas.microsoft.com/office/word/2020/wordml/sdtdatahash" xmlns:w16sdtfl="http://schemas.microsoft.com/office/word/2024/wordml/sdtformatlock" xmlns:w16se="http://schemas.microsoft.com/office/word/2015/wordml/symex" xmlns:wpg="http://schemas.microsoft.com/office/word/2010/wordprocessingGroup" xmlns:wpi="http://schemas.microsoft.com/office/word/2010/wordprocessingInk" xmlns:wne="http://schemas.microsoft.com/office/word/2006/wordml" xmlns:wps="http://schemas.microsoft.com/office/word/2010/wordprocessingShape" mc:Ignorable="w14 w15 w16se w16cid w16 w16cex w16sdtdh w16sdtfl w16du wp14">
+<w:document xmlns:wpc="http://schemas.microsoft.com/office/word/2010/wordprocessingCanvas" xmlns:cx="http://schemas.microsoft.com/office/drawing/2014/chartex" xmlns:cx1="http://schemas.microsoft.com/office/drawing/2015/9/8/chartex" xmlns:cx2="http://schemas.microsoft.com/office/drawing/2015/10/21/chartex" xmlns:cx3="http://schemas.microsoft.com/office/drawing/2016/5/9/chartex" xmlns:cx4="http://schemas.microsoft.com/office/drawing/2016/5/10/chartex" xmlns:cx5="http://schemas.microsoft.com/office/drawing/2016/5/11/chartex" xmlns:cx6="http://schemas.microsoft.com/office/drawing/2016/5/12/chartex" xmlns:cx7="http://schemas.microsoft.com/office/drawing/2016/5/13/chartex" xmlns:cx8="http://schemas.microsoft.com/office/drawing/2016/5/14/chartex" xmlns:mc="http://schemas.openxmlformats.org/markup-compatibility/2006" xmlns:aink="http://schemas.microsoft.com/office/drawing/2016/ink" xmlns:am3d="http://schemas.microsoft.com/office/drawing/2017/model3d" xmlns:o="urn:schemas-microsoft-com:office:office" xmlns:oel="http://schemas.microsoft.com/office/2019/extlst" xmlns:r="http://schemas.openxmlformats.org/officeDocument/2006/relationships" xmlns:m="http://schemas.openxmlformats.org/officeDocument/2006/math" xmlns:v="urn:schemas-microsoft-com:vml" xmlns:wp14="http://schemas.microsoft.com/office/word/2010/wordprocessingDrawing" xmlns:wp="http://schemas.openxmlformats.org/drawingml/2006/wordprocessingDrawing" xmlns:w10="urn:schemas-microsoft-com:office:word" xmlns:w="http://schemas.openxmlformats.org/wordprocessingml/2006/main" xmlns:w14="http://schemas.microsoft.com/office/word/2010/wordml" xmlns:w15="http://schemas.microsoft.com/office/word/2012/wordml" xmlns:w16cei="http://schemas.microsoft.com/office/word/2026/wordml/cei" xmlns:w16cex="http://schemas.microsoft.com/office/word/2018/wordml/cex" xmlns:w16cid="http://schemas.microsoft.com/office/word/2016/wordml/cid" xmlns:w16="http://schemas.microsoft.com/office/word/2018/wordml" xmlns:w16du="http://schemas.microsoft.com/office/word/2023/wordml/word16du" xmlns:w16sdtdh="http://schemas.microsoft.com/office/word/2020/wordml/sdtdatahash" xmlns:w16sdtfl="http://schemas.microsoft.com/office/word/2024/wordml/sdtformatlock" xmlns:w16se="http://schemas.microsoft.com/office/word/2015/wordml/symex" xmlns:wpg="http://schemas.microsoft.com/office/word/2010/wordprocessingGroup" xmlns:wpi="http://schemas.microsoft.com/office/word/2010/wordprocessingInk" xmlns:wne="http://schemas.microsoft.com/office/word/2006/wordml" xmlns:wps="http://schemas.microsoft.com/office/word/2010/wordprocessingShape" mc:Ignorable="w14 w15 w16se w16cid w16 w16cex w16sdtdh w16sdtfl w16du wp14">
   <w:body>
     <w:p>
       <w:pPr>
@@ -2604,7 +2604,6 @@
     <w:p>
       <w:pPr>
         <w:spacing w:before="120" w:after="120" w:line="288" w:lineRule="auto"/>
-        <w:ind w:left="426"/>
         <w:jc w:val="both"/>
         <w:rPr>
           <w:bCs/>
@@ -2613,6 +2612,15 @@
           <w:szCs w:val="26"/>
         </w:rPr>
       </w:pPr>
+      <w:r>
+        <w:rPr>
+          <w:bCs/>
+          <w:iCs/>
+          <w:sz w:val="26"/>
+          <w:szCs w:val="26"/>
+        </w:rPr>
+        <w:t>{{bang_tinh_tien_ban_quyen}}</w:t>
+      </w:r>
     </w:p>
     <w:p>
       <w:pPr>
@@ -4712,6 +4720,11 @@
         </w:rPr>
       </w:pPr>
     </w:p>
+    <w:p>
+      <w:r>
+        <w:t>{{bang_tinh_tien_ban_quyen}}</w:t>
+      </w:r>
+    </w:p>
     <w:sectPr>
       <w:footerReference w:type="even" r:id="rId9"/>
       <w:footerReference w:type="default" r:id="rId10"/>
@@ -4720,17 +4733,12 @@
       <w:cols w:space="720"/>
       <w:docGrid w:linePitch="381"/>
     </w:sectPr>
-    <w:p>
-      <w:r>
-        <w:t xml:space="preserve">{{bang_tinh_tien_ban_quyen}}</w:t>
-      </w:r>
-    </w:p>
   </w:body>
 </w:document>
 </file>
 
 <file path=word/endnotes.xml><?xml version="1.0" encoding="utf-8"?>
-<w:endnotes xmlns:wpc="http://schemas.microsoft.com/office/word/2010/wordprocessingCanvas" xmlns:cx="http://schemas.microsoft.com/office/drawing/2014/chartex" xmlns:cx1="http://schemas.microsoft.com/office/drawing/2015/9/8/chartex" xmlns:cx2="http://schemas.microsoft.com/office/drawing/2015/10/21/chartex" xmlns:cx3="http://schemas.microsoft.com/office/drawing/2016/5/9/chartex" xmlns:cx4="http://schemas.microsoft.com/office/drawing/2016/5/10/chartex" xmlns:cx5="http://schemas.microsoft.com/office/drawing/2016/5/11/chartex" xmlns:cx6="http://schemas.microsoft.com/office/drawing/2016/5/12/chartex" xmlns:cx7="http://schemas.microsoft.com/office/drawing/2016/5/13/chartex" xmlns:cx8="http://schemas.microsoft.com/office/drawing/2016/5/14/chartex" xmlns:mc="http://schemas.openxmlformats.org/markup-compatibility/2006" xmlns:aink="http://schemas.microsoft.com/office/drawing/2016/ink" xmlns:am3d="http://schemas.microsoft.com/office/drawing/2017/model3d" xmlns:o="urn:schemas-microsoft-com:office:office" xmlns:oel="http://schemas.microsoft.com/office/2019/extlst" xmlns:r="http://schemas.openxmlformats.org/officeDocument/2006/relationships" xmlns:m="http://schemas.openxmlformats.org/officeDocument/2006/math" xmlns:v="urn:schemas-microsoft-com:vml" xmlns:wp14="http://schemas.microsoft.com/office/word/2010/wordprocessingDrawing" xmlns:wp="http://schemas.openxmlformats.org/drawingml/2006/wordprocessingDrawing" xmlns:w10="urn:schemas-microsoft-com:office:word" xmlns:w="http://schemas.openxmlformats.org/wordprocessingml/2006/main" xmlns:w14="http://schemas.microsoft.com/office/word/2010/wordml" xmlns:w15="http://schemas.microsoft.com/office/word/2012/wordml" xmlns:w16cex="http://schemas.microsoft.com/office/word/2018/wordml/cex" xmlns:w16cid="http://schemas.microsoft.com/office/word/2016/wordml/cid" xmlns:w16="http://schemas.microsoft.com/office/word/2018/wordml" xmlns:w16du="http://schemas.microsoft.com/office/word/2023/wordml/word16du" xmlns:w16sdtdh="http://schemas.microsoft.com/office/word/2020/wordml/sdtdatahash" xmlns:w16sdtfl="http://schemas.microsoft.com/office/word/2024/wordml/sdtformatlock" xmlns:w16se="http://schemas.microsoft.com/office/word/2015/wordml/symex" xmlns:wpg="http://schemas.microsoft.com/office/word/2010/wordprocessingGroup" xmlns:wpi="http://schemas.microsoft.com/office/word/2010/wordprocessingInk" xmlns:wne="http://schemas.microsoft.com/office/word/2006/wordml" xmlns:wps="http://schemas.microsoft.com/office/word/2010/wordprocessingShape" mc:Ignorable="w14 w15 w16se w16cid w16 w16cex w16sdtdh w16sdtfl w16du wp14">
+<w:endnotes xmlns:wpc="http://schemas.microsoft.com/office/word/2010/wordprocessingCanvas" xmlns:cx="http://schemas.microsoft.com/office/drawing/2014/chartex" xmlns:cx1="http://schemas.microsoft.com/office/drawing/2015/9/8/chartex" xmlns:cx2="http://schemas.microsoft.com/office/drawing/2015/10/21/chartex" xmlns:cx3="http://schemas.microsoft.com/office/drawing/2016/5/9/chartex" xmlns:cx4="http://schemas.microsoft.com/office/drawing/2016/5/10/chartex" xmlns:cx5="http://schemas.microsoft.com/office/drawing/2016/5/11/chartex" xmlns:cx6="http://schemas.microsoft.com/office/drawing/2016/5/12/chartex" xmlns:cx7="http://schemas.microsoft.com/office/drawing/2016/5/13/chartex" xmlns:cx8="http://schemas.microsoft.com/office/drawing/2016/5/14/chartex" xmlns:mc="http://schemas.openxmlformats.org/markup-compatibility/2006" xmlns:aink="http://schemas.microsoft.com/office/drawing/2016/ink" xmlns:am3d="http://schemas.microsoft.com/office/drawing/2017/model3d" xmlns:o="urn:schemas-microsoft-com:office:office" xmlns:oel="http://schemas.microsoft.com/office/2019/extlst" xmlns:r="http://schemas.openxmlformats.org/officeDocument/2006/relationships" xmlns:m="http://schemas.openxmlformats.org/officeDocument/2006/math" xmlns:v="urn:schemas-microsoft-com:vml" xmlns:wp14="http://schemas.microsoft.com/office/word/2010/wordprocessingDrawing" xmlns:wp="http://schemas.openxmlformats.org/drawingml/2006/wordprocessingDrawing" xmlns:w10="urn:schemas-microsoft-com:office:word" xmlns:w="http://schemas.openxmlformats.org/wordprocessingml/2006/main" xmlns:w14="http://schemas.microsoft.com/office/word/2010/wordml" xmlns:w15="http://schemas.microsoft.com/office/word/2012/wordml" xmlns:w16cei="http://schemas.microsoft.com/office/word/2026/wordml/cei" xmlns:w16cex="http://schemas.microsoft.com/office/word/2018/wordml/cex" xmlns:w16cid="http://schemas.microsoft.com/office/word/2016/wordml/cid" xmlns:w16="http://schemas.microsoft.com/office/word/2018/wordml" xmlns:w16du="http://schemas.microsoft.com/office/word/2023/wordml/word16du" xmlns:w16sdtdh="http://schemas.microsoft.com/office/word/2020/wordml/sdtdatahash" xmlns:w16sdtfl="http://schemas.microsoft.com/office/word/2024/wordml/sdtformatlock" xmlns:w16se="http://schemas.microsoft.com/office/word/2015/wordml/symex" xmlns:wpg="http://schemas.microsoft.com/office/word/2010/wordprocessingGroup" xmlns:wpi="http://schemas.microsoft.com/office/word/2010/wordprocessingInk" xmlns:wne="http://schemas.microsoft.com/office/word/2006/wordml" xmlns:wps="http://schemas.microsoft.com/office/word/2010/wordprocessingShape" mc:Ignorable="w14 w15 w16se w16cid w16 w16cex w16sdtdh w16sdtfl w16du wp14">
   <w:endnote w:type="separator" w:id="-1">
     <w:p>
       <w:r>
@@ -4749,7 +4757,7 @@
 </file>
 
 <file path=word/footer1.xml><?xml version="1.0" encoding="utf-8"?>
-<w:ftr xmlns:wpc="http://schemas.microsoft.com/office/word/2010/wordprocessingCanvas" xmlns:cx="http://schemas.microsoft.com/office/drawing/2014/chartex" xmlns:cx1="http://schemas.microsoft.com/office/drawing/2015/9/8/chartex" xmlns:cx2="http://schemas.microsoft.com/office/drawing/2015/10/21/chartex" xmlns:cx3="http://schemas.microsoft.com/office/drawing/2016/5/9/chartex" xmlns:cx4="http://schemas.microsoft.com/office/drawing/2016/5/10/chartex" xmlns:cx5="http://schemas.microsoft.com/office/drawing/2016/5/11/chartex" xmlns:cx6="http://schemas.microsoft.com/office/drawing/2016/5/12/chartex" xmlns:cx7="http://schemas.microsoft.com/office/drawing/2016/5/13/chartex" xmlns:cx8="http://schemas.microsoft.com/office/drawing/2016/5/14/chartex" xmlns:mc="http://schemas.openxmlformats.org/markup-compatibility/2006" xmlns:aink="http://schemas.microsoft.com/office/drawing/2016/ink" xmlns:am3d="http://schemas.microsoft.com/office/drawing/2017/model3d" xmlns:o="urn:schemas-microsoft-com:office:office" xmlns:oel="http://schemas.microsoft.com/office/2019/extlst" xmlns:r="http://schemas.openxmlformats.org/officeDocument/2006/relationships" xmlns:m="http://schemas.openxmlformats.org/officeDocument/2006/math" xmlns:v="urn:schemas-microsoft-com:vml" xmlns:wp14="http://schemas.microsoft.com/office/word/2010/wordprocessingDrawing" xmlns:wp="http://schemas.openxmlformats.org/drawingml/2006/wordprocessingDrawing" xmlns:w10="urn:schemas-microsoft-com:office:word" xmlns:w="http://schemas.openxmlformats.org/wordprocessingml/2006/main" xmlns:w14="http://schemas.microsoft.com/office/word/2010/wordml" xmlns:w15="http://schemas.microsoft.com/office/word/2012/wordml" xmlns:w16cex="http://schemas.microsoft.com/office/word/2018/wordml/cex" xmlns:w16cid="http://schemas.microsoft.com/office/word/2016/wordml/cid" xmlns:w16="http://schemas.microsoft.com/office/word/2018/wordml" xmlns:w16du="http://schemas.microsoft.com/office/word/2023/wordml/word16du" xmlns:w16sdtdh="http://schemas.microsoft.com/office/word/2020/wordml/sdtdatahash" xmlns:w16sdtfl="http://schemas.microsoft.com/office/word/2024/wordml/sdtformatlock" xmlns:w16se="http://schemas.microsoft.com/office/word/2015/wordml/symex" xmlns:wpg="http://schemas.microsoft.com/office/word/2010/wordprocessingGroup" xmlns:wpi="http://schemas.microsoft.com/office/word/2010/wordprocessingInk" xmlns:wne="http://schemas.microsoft.com/office/word/2006/wordml" xmlns:wps="http://schemas.microsoft.com/office/word/2010/wordprocessingShape" mc:Ignorable="w14 w15 w16se w16cid w16 w16cex w16sdtdh w16sdtfl w16du wp14">
+<w:ftr xmlns:wpc="http://schemas.microsoft.com/office/word/2010/wordprocessingCanvas" xmlns:cx="http://schemas.microsoft.com/office/drawing/2014/chartex" xmlns:cx1="http://schemas.microsoft.com/office/drawing/2015/9/8/chartex" xmlns:cx2="http://schemas.microsoft.com/office/drawing/2015/10/21/chartex" xmlns:cx3="http://schemas.microsoft.com/office/drawing/2016/5/9/chartex" xmlns:cx4="http://schemas.microsoft.com/office/drawing/2016/5/10/chartex" xmlns:cx5="http://schemas.microsoft.com/office/drawing/2016/5/11/chartex" xmlns:cx6="http://schemas.microsoft.com/office/drawing/2016/5/12/chartex" xmlns:cx7="http://schemas.microsoft.com/office/drawing/2016/5/13/chartex" xmlns:cx8="http://schemas.microsoft.com/office/drawing/2016/5/14/chartex" xmlns:mc="http://schemas.openxmlformats.org/markup-compatibility/2006" xmlns:aink="http://schemas.microsoft.com/office/drawing/2016/ink" xmlns:am3d="http://schemas.microsoft.com/office/drawing/2017/model3d" xmlns:o="urn:schemas-microsoft-com:office:office" xmlns:oel="http://schemas.microsoft.com/office/2019/extlst" xmlns:r="http://schemas.openxmlformats.org/officeDocument/2006/relationships" xmlns:m="http://schemas.openxmlformats.org/officeDocument/2006/math" xmlns:v="urn:schemas-microsoft-com:vml" xmlns:wp14="http://schemas.microsoft.com/office/word/2010/wordprocessingDrawing" xmlns:wp="http://schemas.openxmlformats.org/drawingml/2006/wordprocessingDrawing" xmlns:w10="urn:schemas-microsoft-com:office:word" xmlns:w="http://schemas.openxmlformats.org/wordprocessingml/2006/main" xmlns:w14="http://schemas.microsoft.com/office/word/2010/wordml" xmlns:w15="http://schemas.microsoft.com/office/word/2012/wordml" xmlns:w16cei="http://schemas.microsoft.com/office/word/2026/wordml/cei" xmlns:w16cex="http://schemas.microsoft.com/office/word/2018/wordml/cex" xmlns:w16cid="http://schemas.microsoft.com/office/word/2016/wordml/cid" xmlns:w16="http://schemas.microsoft.com/office/word/2018/wordml" xmlns:w16du="http://schemas.microsoft.com/office/word/2023/wordml/word16du" xmlns:w16sdtdh="http://schemas.microsoft.com/office/word/2020/wordml/sdtdatahash" xmlns:w16sdtfl="http://schemas.microsoft.com/office/word/2024/wordml/sdtformatlock" xmlns:w16se="http://schemas.microsoft.com/office/word/2015/wordml/symex" xmlns:wpg="http://schemas.microsoft.com/office/word/2010/wordprocessingGroup" xmlns:wpi="http://schemas.microsoft.com/office/word/2010/wordprocessingInk" xmlns:wne="http://schemas.microsoft.com/office/word/2006/wordml" xmlns:wps="http://schemas.microsoft.com/office/word/2010/wordprocessingShape" mc:Ignorable="w14 w15 w16se w16cid w16 w16cex w16sdtdh w16sdtfl w16du wp14">
   <w:p>
     <w:pPr>
       <w:pStyle w:val="Footer"/>
@@ -4800,7 +4808,7 @@
 </file>
 
 <file path=word/footer2.xml><?xml version="1.0" encoding="utf-8"?>
-<w:ftr xmlns:wpc="http://schemas.microsoft.com/office/word/2010/wordprocessingCanvas" xmlns:cx="http://schemas.microsoft.com/office/drawing/2014/chartex" xmlns:cx1="http://schemas.microsoft.com/office/drawing/2015/9/8/chartex" xmlns:cx2="http://schemas.microsoft.com/office/drawing/2015/10/21/chartex" xmlns:cx3="http://schemas.microsoft.com/office/drawing/2016/5/9/chartex" xmlns:cx4="http://schemas.microsoft.com/office/drawing/2016/5/10/chartex" xmlns:cx5="http://schemas.microsoft.com/office/drawing/2016/5/11/chartex" xmlns:cx6="http://schemas.microsoft.com/office/drawing/2016/5/12/chartex" xmlns:cx7="http://schemas.microsoft.com/office/drawing/2016/5/13/chartex" xmlns:cx8="http://schemas.microsoft.com/office/drawing/2016/5/14/chartex" xmlns:mc="http://schemas.openxmlformats.org/markup-compatibility/2006" xmlns:aink="http://schemas.microsoft.com/office/drawing/2016/ink" xmlns:am3d="http://schemas.microsoft.com/office/drawing/2017/model3d" xmlns:o="urn:schemas-microsoft-com:office:office" xmlns:oel="http://schemas.microsoft.com/office/2019/extlst" xmlns:r="http://schemas.openxmlformats.org/officeDocument/2006/relationships" xmlns:m="http://schemas.openxmlformats.org/officeDocument/2006/math" xmlns:v="urn:schemas-microsoft-com:vml" xmlns:wp14="http://schemas.microsoft.com/office/word/2010/wordprocessingDrawing" xmlns:wp="http://schemas.openxmlformats.org/drawingml/2006/wordprocessingDrawing" xmlns:w10="urn:schemas-microsoft-com:office:word" xmlns:w="http://schemas.openxmlformats.org/wordprocessingml/2006/main" xmlns:w14="http://schemas.microsoft.com/office/word/2010/wordml" xmlns:w15="http://schemas.microsoft.com/office/word/2012/wordml" xmlns:w16cex="http://schemas.microsoft.com/office/word/2018/wordml/cex" xmlns:w16cid="http://schemas.microsoft.com/office/word/2016/wordml/cid" xmlns:w16="http://schemas.microsoft.com/office/word/2018/wordml" xmlns:w16du="http://schemas.microsoft.com/office/word/2023/wordml/word16du" xmlns:w16sdtdh="http://schemas.microsoft.com/office/word/2020/wordml/sdtdatahash" xmlns:w16sdtfl="http://schemas.microsoft.com/office/word/2024/wordml/sdtformatlock" xmlns:w16se="http://schemas.microsoft.com/office/word/2015/wordml/symex" xmlns:wpg="http://schemas.microsoft.com/office/word/2010/wordprocessingGroup" xmlns:wpi="http://schemas.microsoft.com/office/word/2010/wordprocessingInk" xmlns:wne="http://schemas.microsoft.com/office/word/2006/wordml" xmlns:wps="http://schemas.microsoft.com/office/word/2010/wordprocessingShape" mc:Ignorable="w14 w15 w16se w16cid w16 w16cex w16sdtdh w16sdtfl w16du wp14">
+<w:ftr xmlns:wpc="http://schemas.microsoft.com/office/word/2010/wordprocessingCanvas" xmlns:cx="http://schemas.microsoft.com/office/drawing/2014/chartex" xmlns:cx1="http://schemas.microsoft.com/office/drawing/2015/9/8/chartex" xmlns:cx2="http://schemas.microsoft.com/office/drawing/2015/10/21/chartex" xmlns:cx3="http://schemas.microsoft.com/office/drawing/2016/5/9/chartex" xmlns:cx4="http://schemas.microsoft.com/office/drawing/2016/5/10/chartex" xmlns:cx5="http://schemas.microsoft.com/office/drawing/2016/5/11/chartex" xmlns:cx6="http://schemas.microsoft.com/office/drawing/2016/5/12/chartex" xmlns:cx7="http://schemas.microsoft.com/office/drawing/2016/5/13/chartex" xmlns:cx8="http://schemas.microsoft.com/office/drawing/2016/5/14/chartex" xmlns:mc="http://schemas.openxmlformats.org/markup-compatibility/2006" xmlns:aink="http://schemas.microsoft.com/office/drawing/2016/ink" xmlns:am3d="http://schemas.microsoft.com/office/drawing/2017/model3d" xmlns:o="urn:schemas-microsoft-com:office:office" xmlns:oel="http://schemas.microsoft.com/office/2019/extlst" xmlns:r="http://schemas.openxmlformats.org/officeDocument/2006/relationships" xmlns:m="http://schemas.openxmlformats.org/officeDocument/2006/math" xmlns:v="urn:schemas-microsoft-com:vml" xmlns:wp14="http://schemas.microsoft.com/office/word/2010/wordprocessingDrawing" xmlns:wp="http://schemas.openxmlformats.org/drawingml/2006/wordprocessingDrawing" xmlns:w10="urn:schemas-microsoft-com:office:word" xmlns:w="http://schemas.openxmlformats.org/wordprocessingml/2006/main" xmlns:w14="http://schemas.microsoft.com/office/word/2010/wordml" xmlns:w15="http://schemas.microsoft.com/office/word/2012/wordml" xmlns:w16cei="http://schemas.microsoft.com/office/word/2026/wordml/cei" xmlns:w16cex="http://schemas.microsoft.com/office/word/2018/wordml/cex" xmlns:w16cid="http://schemas.microsoft.com/office/word/2016/wordml/cid" xmlns:w16="http://schemas.microsoft.com/office/word/2018/wordml" xmlns:w16du="http://schemas.microsoft.com/office/word/2023/wordml/word16du" xmlns:w16sdtdh="http://schemas.microsoft.com/office/word/2020/wordml/sdtdatahash" xmlns:w16sdtfl="http://schemas.microsoft.com/office/word/2024/wordml/sdtformatlock" xmlns:w16se="http://schemas.microsoft.com/office/word/2015/wordml/symex" xmlns:wpg="http://schemas.microsoft.com/office/word/2010/wordprocessingGroup" xmlns:wpi="http://schemas.microsoft.com/office/word/2010/wordprocessingInk" xmlns:wne="http://schemas.microsoft.com/office/word/2006/wordml" xmlns:wps="http://schemas.microsoft.com/office/word/2010/wordprocessingShape" mc:Ignorable="w14 w15 w16se w16cid w16 w16cex w16sdtdh w16sdtfl w16du wp14">
   <w:p>
     <w:pPr>
       <w:pStyle w:val="Footer"/>
@@ -4857,7 +4865,7 @@
 </file>
 
 <file path=word/footnotes.xml><?xml version="1.0" encoding="utf-8"?>
-<w:footnotes xmlns:wpc="http://schemas.microsoft.com/office/word/2010/wordprocessingCanvas" xmlns:cx="http://schemas.microsoft.com/office/drawing/2014/chartex" xmlns:cx1="http://schemas.microsoft.com/office/drawing/2015/9/8/chartex" xmlns:cx2="http://schemas.microsoft.com/office/drawing/2015/10/21/chartex" xmlns:cx3="http://schemas.microsoft.com/office/drawing/2016/5/9/chartex" xmlns:cx4="http://schemas.microsoft.com/office/drawing/2016/5/10/chartex" xmlns:cx5="http://schemas.microsoft.com/office/drawing/2016/5/11/chartex" xmlns:cx6="http://schemas.microsoft.com/office/drawing/2016/5/12/chartex" xmlns:cx7="http://schemas.microsoft.com/office/drawing/2016/5/13/chartex" xmlns:cx8="http://schemas.microsoft.com/office/drawing/2016/5/14/chartex" xmlns:mc="http://schemas.openxmlformats.org/markup-compatibility/2006" xmlns:aink="http://schemas.microsoft.com/office/drawing/2016/ink" xmlns:am3d="http://schemas.microsoft.com/office/drawing/2017/model3d" xmlns:o="urn:schemas-microsoft-com:office:office" xmlns:oel="http://schemas.microsoft.com/office/2019/extlst" xmlns:r="http://schemas.openxmlformats.org/officeDocument/2006/relationships" xmlns:m="http://schemas.openxmlformats.org/officeDocument/2006/math" xmlns:v="urn:schemas-microsoft-com:vml" xmlns:wp14="http://schemas.microsoft.com/office/word/2010/wordprocessingDrawing" xmlns:wp="http://schemas.openxmlformats.org/drawingml/2006/wordprocessingDrawing" xmlns:w10="urn:schemas-microsoft-com:office:word" xmlns:w="http://schemas.openxmlformats.org/wordprocessingml/2006/main" xmlns:w14="http://schemas.microsoft.com/office/word/2010/wordml" xmlns:w15="http://schemas.microsoft.com/office/word/2012/wordml" xmlns:w16cex="http://schemas.microsoft.com/office/word/2018/wordml/cex" xmlns:w16cid="http://schemas.microsoft.com/office/word/2016/wordml/cid" xmlns:w16="http://schemas.microsoft.com/office/word/2018/wordml" xmlns:w16du="http://schemas.microsoft.com/office/word/2023/wordml/word16du" xmlns:w16sdtdh="http://schemas.microsoft.com/office/word/2020/wordml/sdtdatahash" xmlns:w16sdtfl="http://schemas.microsoft.com/office/word/2024/wordml/sdtformatlock" xmlns:w16se="http://schemas.microsoft.com/office/word/2015/wordml/symex" xmlns:wpg="http://schemas.microsoft.com/office/word/2010/wordprocessingGroup" xmlns:wpi="http://schemas.microsoft.com/office/word/2010/wordprocessingInk" xmlns:wne="http://schemas.microsoft.com/office/word/2006/wordml" xmlns:wps="http://schemas.microsoft.com/office/word/2010/wordprocessingShape" mc:Ignorable="w14 w15 w16se w16cid w16 w16cex w16sdtdh w16sdtfl w16du wp14">
+<w:footnotes xmlns:wpc="http://schemas.microsoft.com/office/word/2010/wordprocessingCanvas" xmlns:cx="http://schemas.microsoft.com/office/drawing/2014/chartex" xmlns:cx1="http://schemas.microsoft.com/office/drawing/2015/9/8/chartex" xmlns:cx2="http://schemas.microsoft.com/office/drawing/2015/10/21/chartex" xmlns:cx3="http://schemas.microsoft.com/office/drawing/2016/5/9/chartex" xmlns:cx4="http://schemas.microsoft.com/office/drawing/2016/5/10/chartex" xmlns:cx5="http://schemas.microsoft.com/office/drawing/2016/5/11/chartex" xmlns:cx6="http://schemas.microsoft.com/office/drawing/2016/5/12/chartex" xmlns:cx7="http://schemas.microsoft.com/office/drawing/2016/5/13/chartex" xmlns:cx8="http://schemas.microsoft.com/office/drawing/2016/5/14/chartex" xmlns:mc="http://schemas.openxmlformats.org/markup-compatibility/2006" xmlns:aink="http://schemas.microsoft.com/office/drawing/2016/ink" xmlns:am3d="http://schemas.microsoft.com/office/drawing/2017/model3d" xmlns:o="urn:schemas-microsoft-com:office:office" xmlns:oel="http://schemas.microsoft.com/office/2019/extlst" xmlns:r="http://schemas.openxmlformats.org/officeDocument/2006/relationships" xmlns:m="http://schemas.openxmlformats.org/officeDocument/2006/math" xmlns:v="urn:schemas-microsoft-com:vml" xmlns:wp14="http://schemas.microsoft.com/office/word/2010/wordprocessingDrawing" xmlns:wp="http://schemas.openxmlformats.org/drawingml/2006/wordprocessingDrawing" xmlns:w10="urn:schemas-microsoft-com:office:word" xmlns:w="http://schemas.openxmlformats.org/wordprocessingml/2006/main" xmlns:w14="http://schemas.microsoft.com/office/word/2010/wordml" xmlns:w15="http://schemas.microsoft.com/office/word/2012/wordml" xmlns:w16cei="http://schemas.microsoft.com/office/word/2026/wordml/cei" xmlns:w16cex="http://schemas.microsoft.com/office/word/2018/wordml/cex" xmlns:w16cid="http://schemas.microsoft.com/office/word/2016/wordml/cid" xmlns:w16="http://schemas.microsoft.com/office/word/2018/wordml" xmlns:w16du="http://schemas.microsoft.com/office/word/2023/wordml/word16du" xmlns:w16sdtdh="http://schemas.microsoft.com/office/word/2020/wordml/sdtdatahash" xmlns:w16sdtfl="http://schemas.microsoft.com/office/word/2024/wordml/sdtformatlock" xmlns:w16se="http://schemas.microsoft.com/office/word/2015/wordml/symex" xmlns:wpg="http://schemas.microsoft.com/office/word/2010/wordprocessingGroup" xmlns:wpi="http://schemas.microsoft.com/office/word/2010/wordprocessingInk" xmlns:wne="http://schemas.microsoft.com/office/word/2006/wordml" xmlns:wps="http://schemas.microsoft.com/office/word/2010/wordprocessingShape" mc:Ignorable="w14 w15 w16se w16cid w16 w16cex w16sdtdh w16sdtfl w16du wp14">
   <w:footnote w:type="separator" w:id="-1">
     <w:p>
       <w:r>
@@ -4876,7 +4884,7 @@
 </file>
 
 <file path=word/numbering.xml><?xml version="1.0" encoding="utf-8"?>
-<w:numbering xmlns:wpc="http://schemas.microsoft.com/office/word/2010/wordprocessingCanvas" xmlns:cx="http://schemas.microsoft.com/office/drawing/2014/chartex" xmlns:cx1="http://schemas.microsoft.com/office/drawing/2015/9/8/chartex" xmlns:cx2="http://schemas.microsoft.com/office/drawing/2015/10/21/chartex" xmlns:cx3="http://schemas.microsoft.com/office/drawing/2016/5/9/chartex" xmlns:cx4="http://schemas.microsoft.com/office/drawing/2016/5/10/chartex" xmlns:cx5="http://schemas.microsoft.com/office/drawing/2016/5/11/chartex" xmlns:cx6="http://schemas.microsoft.com/office/drawing/2016/5/12/chartex" xmlns:cx7="http://schemas.microsoft.com/office/drawing/2016/5/13/chartex" xmlns:cx8="http://schemas.microsoft.com/office/drawing/2016/5/14/chartex" xmlns:mc="http://schemas.openxmlformats.org/markup-compatibility/2006" xmlns:aink="http://schemas.microsoft.com/office/drawing/2016/ink" xmlns:am3d="http://schemas.microsoft.com/office/drawing/2017/model3d" xmlns:o="urn:schemas-microsoft-com:office:office" xmlns:oel="http://schemas.microsoft.com/office/2019/extlst" xmlns:r="http://schemas.openxmlformats.org/officeDocument/2006/relationships" xmlns:m="http://schemas.openxmlformats.org/officeDocument/2006/math" xmlns:v="urn:schemas-microsoft-com:vml" xmlns:wp14="http://schemas.microsoft.com/office/word/2010/wordprocessingDrawing" xmlns:wp="http://schemas.openxmlformats.org/drawingml/2006/wordprocessingDrawing" xmlns:w10="urn:schemas-microsoft-com:office:word" xmlns:w="http://schemas.openxmlformats.org/wordprocessingml/2006/main" xmlns:w14="http://schemas.microsoft.com/office/word/2010/wordml" xmlns:w15="http://schemas.microsoft.com/office/word/2012/wordml" xmlns:w16cex="http://schemas.microsoft.com/office/word/2018/wordml/cex" xmlns:w16cid="http://schemas.microsoft.com/office/word/2016/wordml/cid" xmlns:w16="http://schemas.microsoft.com/office/word/2018/wordml" xmlns:w16du="http://schemas.microsoft.com/office/word/2023/wordml/word16du" xmlns:w16sdtdh="http://schemas.microsoft.com/office/word/2020/wordml/sdtdatahash" xmlns:w16sdtfl="http://schemas.microsoft.com/office/word/2024/wordml/sdtformatlock" xmlns:w16se="http://schemas.microsoft.com/office/word/2015/wordml/symex" xmlns:wpg="http://schemas.microsoft.com/office/word/2010/wordprocessingGroup" xmlns:wpi="http://schemas.microsoft.com/office/word/2010/wordprocessingInk" xmlns:wne="http://schemas.microsoft.com/office/word/2006/wordml" xmlns:wps="http://schemas.microsoft.com/office/word/2010/wordprocessingShape" mc:Ignorable="w14 w15 w16se w16cid w16 w16cex w16sdtdh w16sdtfl w16du wp14">
+<w:numbering xmlns:wpc="http://schemas.microsoft.com/office/word/2010/wordprocessingCanvas" xmlns:cx="http://schemas.microsoft.com/office/drawing/2014/chartex" xmlns:cx1="http://schemas.microsoft.com/office/drawing/2015/9/8/chartex" xmlns:cx2="http://schemas.microsoft.com/office/drawing/2015/10/21/chartex" xmlns:cx3="http://schemas.microsoft.com/office/drawing/2016/5/9/chartex" xmlns:cx4="http://schemas.microsoft.com/office/drawing/2016/5/10/chartex" xmlns:cx5="http://schemas.microsoft.com/office/drawing/2016/5/11/chartex" xmlns:cx6="http://schemas.microsoft.com/office/drawing/2016/5/12/chartex" xmlns:cx7="http://schemas.microsoft.com/office/drawing/2016/5/13/chartex" xmlns:cx8="http://schemas.microsoft.com/office/drawing/2016/5/14/chartex" xmlns:mc="http://schemas.openxmlformats.org/markup-compatibility/2006" xmlns:aink="http://schemas.microsoft.com/office/drawing/2016/ink" xmlns:am3d="http://schemas.microsoft.com/office/drawing/2017/model3d" xmlns:o="urn:schemas-microsoft-com:office:office" xmlns:oel="http://schemas.microsoft.com/office/2019/extlst" xmlns:r="http://schemas.openxmlformats.org/officeDocument/2006/relationships" xmlns:m="http://schemas.openxmlformats.org/officeDocument/2006/math" xmlns:v="urn:schemas-microsoft-com:vml" xmlns:wp14="http://schemas.microsoft.com/office/word/2010/wordprocessingDrawing" xmlns:wp="http://schemas.openxmlformats.org/drawingml/2006/wordprocessingDrawing" xmlns:w10="urn:schemas-microsoft-com:office:word" xmlns:w="http://schemas.openxmlformats.org/wordprocessingml/2006/main" xmlns:w14="http://schemas.microsoft.com/office/word/2010/wordml" xmlns:w15="http://schemas.microsoft.com/office/word/2012/wordml" xmlns:w16cei="http://schemas.microsoft.com/office/word/2026/wordml/cei" xmlns:w16cex="http://schemas.microsoft.com/office/word/2018/wordml/cex" xmlns:w16cid="http://schemas.microsoft.com/office/word/2016/wordml/cid" xmlns:w16="http://schemas.microsoft.com/office/word/2018/wordml" xmlns:w16du="http://schemas.microsoft.com/office/word/2023/wordml/word16du" xmlns:w16sdtdh="http://schemas.microsoft.com/office/word/2020/wordml/sdtdatahash" xmlns:w16sdtfl="http://schemas.microsoft.com/office/word/2024/wordml/sdtformatlock" xmlns:w16se="http://schemas.microsoft.com/office/word/2015/wordml/symex" xmlns:wpg="http://schemas.microsoft.com/office/word/2010/wordprocessingGroup" xmlns:wpi="http://schemas.microsoft.com/office/word/2010/wordprocessingInk" xmlns:wne="http://schemas.microsoft.com/office/word/2006/wordml" xmlns:wps="http://schemas.microsoft.com/office/word/2010/wordprocessingShape" mc:Ignorable="w14 w15 w16se w16cid w16 w16cex w16sdtdh w16sdtfl w16du wp14">
   <w:abstractNum w:abstractNumId="0" w15:restartNumberingAfterBreak="0">
     <w:nsid w:val="0505472F"/>
     <w:multiLevelType w:val="multilevel"/>
@@ -8359,7 +8367,6 @@
   <w:style w:type="character" w:default="1" w:styleId="DefaultParagraphFont">
     <w:name w:val="Default Paragraph Font"/>
     <w:uiPriority w:val="1"/>
-    <w:semiHidden/>
     <w:unhideWhenUsed/>
   </w:style>
   <w:style w:type="table" w:default="1" w:styleId="TableNormal">

</xml_diff>